<commit_message>
feat(generador): automatizar documentos Fase 1 (requerimiento, pliego y acta)
</commit_message>
<xml_diff>
--- a/src/generador-documentos/templates/acta-inicio-template.docx
+++ b/src/generador-documentos/templates/acta-inicio-template.docx
@@ -6,6 +6,66 @@
       <w:pPr>
         <w:shd w:fill="ffffff" w:val="clear"/>
         <w:spacing w:after="280" w:before="220" w:line="342.85714285714283" w:lineRule="auto"/>
+        <w:jc w:val="both"/>
+        <w:rPr>
+          <w:color w:val="1a1c1e"/>
+        </w:rPr>
+      </w:pPr>
+      <w:r>
+        <w:rPr>
+          <w:b w:val="1"/>
+          <w:bCs w:val="1"/>
+          <w:color w:val="1a1c1e"/>
+          <w:rtl w:val="0"/>
+        </w:rPr>
+        <w:t xml:space="preserve">PROCEDIMIENTO N°:</w:t>
+      </w:r>
+      <w:r>
+        <w:rPr>
+          <w:color w:val="1a1c1e"/>
+          <w:rtl w:val="0"/>
+        </w:rPr>
+        <w:t xml:space="preserve"> </w:t>
+      </w:r>
+      <w:r>
+        <w:rPr>
+          <w:b w:val="1"/>
+          <w:bCs w:val="1"/>
+          <w:color w:val="1a1c1e"/>
+          <w:rtl w:val="0"/>
+        </w:rPr>
+        <w:t xml:space="preserve">{cod_nomenclatura_proceso_au_au}</w:t>
+      </w:r>
+      <w:r>
+        <w:rPr>
+          <w:b w:val="1"/>
+          <w:bCs w:val="1"/>
+          <w:color w:val="1a1c1e"/>
+          <w:rtl w:val="0"/>
+        </w:rPr>
+        <w:br w:type="textWrapping"/>
+      </w:r>
+      <w:r>
+        <w:rPr>
+          <w:b w:val="1"/>
+          <w:bCs w:val="1"/>
+          <w:color w:val="1a1c1e"/>
+          <w:rtl w:val="0"/>
+        </w:rPr>
+        <w:t xml:space="preserve">MODALIDAD:</w:t>
+      </w:r>
+      <w:r>
+        <w:rPr>
+          <w:color w:val="1a1c1e"/>
+          <w:rtl w:val="0"/>
+        </w:rPr>
+        <w:t xml:space="preserve"> CONCURSO ABIERTO ACTO ÚNICO APERTURA ÚNICA</w:t>
+      </w:r>
+    </w:p>
+    <w:p>
+      <w:pPr>
+        <w:shd w:fill="ffffff" w:val="clear"/>
+        <w:spacing w:after="280" w:before="220" w:line="342.85714285714283" w:lineRule="auto"/>
         <w:jc w:val="center"/>
         <w:rPr>
           <w:b w:val="1"/>
@@ -20,11 +80,7 @@
           <w:color w:val="1a1c1e"/>
           <w:rtl w:val="0"/>
         </w:rPr>
-        <w:t xml:space="preserve">REPÚBLICA BOLIVARIANA DE VENEZUELA</w:t>
-        <w:br w:type="textWrapping"/>
-        <w:t xml:space="preserve">{nom_ente_contratante}</w:t>
-        <w:br w:type="textWrapping"/>
-        <w:t xml:space="preserve">COMISIÓN DE CONTRATACIONES</w:t>
+        <w:t xml:space="preserve">ACTA DE INICIO</w:t>
       </w:r>
     </w:p>
     <w:p>
@@ -33,87 +89,8 @@
         <w:spacing w:after="280" w:before="220" w:line="342.85714285714283" w:lineRule="auto"/>
         <w:jc w:val="both"/>
         <w:rPr>
-          <w:color w:val="1a1c1e"/>
-        </w:rPr>
-      </w:pPr>
-      <w:r>
-        <w:rPr>
-          <w:b w:val="1"/>
-          <w:bCs w:val="1"/>
-          <w:color w:val="1a1c1e"/>
-          <w:rtl w:val="0"/>
-        </w:rPr>
-        <w:t xml:space="preserve">PROCEDIMIENTO N°:</w:t>
-      </w:r>
-      <w:r>
-        <w:rPr>
-          <w:color w:val="1a1c1e"/>
-          <w:rtl w:val="0"/>
-        </w:rPr>
-        <w:t xml:space="preserve"> </w:t>
-      </w:r>
-      <w:r>
-        <w:rPr>
-          <w:b w:val="1"/>
-          <w:bCs w:val="1"/>
-          <w:color w:val="1a1c1e"/>
-          <w:rtl w:val="0"/>
-        </w:rPr>
-        <w:t xml:space="preserve">{cod_nomenclatura_proceso_au_au}</w:t>
-      </w:r>
-      <w:r>
-        <w:rPr>
-          <w:b w:val="1"/>
-          <w:bCs w:val="1"/>
-          <w:color w:val="1a1c1e"/>
-          <w:rtl w:val="0"/>
-        </w:rPr>
-        <w:br w:type="textWrapping"/>
-      </w:r>
-      <w:r>
-        <w:rPr>
-          <w:b w:val="1"/>
-          <w:bCs w:val="1"/>
-          <w:color w:val="1a1c1e"/>
-          <w:rtl w:val="0"/>
-        </w:rPr>
-        <w:t xml:space="preserve">MODALIDAD:</w:t>
-      </w:r>
-      <w:r>
-        <w:rPr>
-          <w:color w:val="1a1c1e"/>
-          <w:rtl w:val="0"/>
-        </w:rPr>
-        <w:t xml:space="preserve"> CONCURSO ABIERTO ACTO ÚNICO APERTURA ÚNICA</w:t>
-      </w:r>
-    </w:p>
-    <w:p>
-      <w:pPr>
-        <w:shd w:fill="ffffff" w:val="clear"/>
-        <w:spacing w:after="280" w:before="220" w:line="342.85714285714283" w:lineRule="auto"/>
-        <w:jc w:val="center"/>
-        <w:rPr>
-          <w:b w:val="1"/>
-          <w:bCs w:val="1"/>
-          <w:color w:val="1a1c1e"/>
-        </w:rPr>
-      </w:pPr>
-      <w:r>
-        <w:rPr>
-          <w:b w:val="1"/>
-          <w:bCs w:val="1"/>
-          <w:color w:val="1a1c1e"/>
-          <w:rtl w:val="0"/>
-        </w:rPr>
-        <w:t xml:space="preserve">ACTA DE INICIO</w:t>
-      </w:r>
-    </w:p>
-    <w:p>
-      <w:pPr>
-        <w:shd w:fill="ffffff" w:val="clear"/>
-        <w:spacing w:after="280" w:before="220" w:line="342.85714285714283" w:lineRule="auto"/>
-        <w:jc w:val="both"/>
-        <w:rPr>
+          <w:b w:val="1"/>
+          <w:bCs w:val="1"/>
           <w:color w:val="1a1c1e"/>
         </w:rPr>
       </w:pPr>
@@ -175,6 +152,11 @@
           <w:rtl w:val="0"/>
         </w:rPr>
         <w:t xml:space="preserve"> a saber:</w:t>
+      </w:r>
+      <w:r>
+        <w:rPr>
+          <w:rtl w:val="0"/>
+        </w:rPr>
       </w:r>
     </w:p>
     <w:p>
@@ -574,7 +556,7 @@
           <w:color w:val="1a1c1e"/>
           <w:rtl w:val="0"/>
         </w:rPr>
-        <w:t xml:space="preserve">Objeto de la Contratación: {desc_objeto_contratacion}.</w:t>
+        <w:t xml:space="preserve">Objeto de la Contratación: {desc_objeto_contratacion_au_au}.</w:t>
       </w:r>
       <w:r>
         <w:rPr>
@@ -837,10 +819,10 @@
         <w:tc>
           <w:tcPr>
             <w:tcBorders>
-              <w:top w:color="000000" w:space="0" w:sz="0" w:val="nil"/>
-              <w:left w:color="000000" w:space="0" w:sz="0" w:val="nil"/>
-              <w:bottom w:color="000000" w:space="0" w:sz="0" w:val="nil"/>
-              <w:right w:color="000000" w:space="0" w:sz="0" w:val="nil"/>
+              <w:top w:color="000000" w:space="0" w:sz="8" w:val="single"/>
+              <w:left w:color="000000" w:space="0" w:sz="8" w:val="single"/>
+              <w:bottom w:color="000000" w:space="0" w:sz="8" w:val="single"/>
+              <w:right w:color="000000" w:space="0" w:sz="8" w:val="single"/>
             </w:tcBorders>
             <w:tcMar>
               <w:top w:w="100.0" w:type="dxa"/>
@@ -877,10 +859,10 @@
         <w:tc>
           <w:tcPr>
             <w:tcBorders>
-              <w:top w:color="000000" w:space="0" w:sz="0" w:val="nil"/>
-              <w:left w:color="000000" w:space="0" w:sz="0" w:val="nil"/>
-              <w:bottom w:color="000000" w:space="0" w:sz="0" w:val="nil"/>
-              <w:right w:color="000000" w:space="0" w:sz="0" w:val="nil"/>
+              <w:top w:color="000000" w:space="0" w:sz="8" w:val="single"/>
+              <w:left w:color="000000" w:space="0" w:sz="8" w:val="single"/>
+              <w:bottom w:color="000000" w:space="0" w:sz="8" w:val="single"/>
+              <w:right w:color="000000" w:space="0" w:sz="8" w:val="single"/>
             </w:tcBorders>
             <w:tcMar>
               <w:top w:w="100.0" w:type="dxa"/>
@@ -917,10 +899,10 @@
         <w:tc>
           <w:tcPr>
             <w:tcBorders>
-              <w:top w:color="000000" w:space="0" w:sz="0" w:val="nil"/>
-              <w:left w:color="000000" w:space="0" w:sz="0" w:val="nil"/>
-              <w:bottom w:color="000000" w:space="0" w:sz="0" w:val="nil"/>
-              <w:right w:color="000000" w:space="0" w:sz="0" w:val="nil"/>
+              <w:top w:color="000000" w:space="0" w:sz="8" w:val="single"/>
+              <w:left w:color="000000" w:space="0" w:sz="8" w:val="single"/>
+              <w:bottom w:color="000000" w:space="0" w:sz="8" w:val="single"/>
+              <w:right w:color="000000" w:space="0" w:sz="8" w:val="single"/>
             </w:tcBorders>
             <w:tcMar>
               <w:top w:w="100.0" w:type="dxa"/>
@@ -964,10 +946,10 @@
         <w:tc>
           <w:tcPr>
             <w:tcBorders>
-              <w:top w:color="000000" w:space="0" w:sz="0" w:val="nil"/>
-              <w:left w:color="000000" w:space="0" w:sz="0" w:val="nil"/>
-              <w:bottom w:color="000000" w:space="0" w:sz="0" w:val="nil"/>
-              <w:right w:color="000000" w:space="0" w:sz="0" w:val="nil"/>
+              <w:top w:color="000000" w:space="0" w:sz="8" w:val="single"/>
+              <w:left w:color="000000" w:space="0" w:sz="8" w:val="single"/>
+              <w:bottom w:color="000000" w:space="0" w:sz="8" w:val="single"/>
+              <w:right w:color="000000" w:space="0" w:sz="8" w:val="single"/>
             </w:tcBorders>
             <w:tcMar>
               <w:top w:w="100.0" w:type="dxa"/>
@@ -1004,10 +986,10 @@
         <w:tc>
           <w:tcPr>
             <w:tcBorders>
-              <w:top w:color="000000" w:space="0" w:sz="0" w:val="nil"/>
-              <w:left w:color="000000" w:space="0" w:sz="0" w:val="nil"/>
-              <w:bottom w:color="000000" w:space="0" w:sz="0" w:val="nil"/>
-              <w:right w:color="000000" w:space="0" w:sz="0" w:val="nil"/>
+              <w:top w:color="000000" w:space="0" w:sz="8" w:val="single"/>
+              <w:left w:color="000000" w:space="0" w:sz="8" w:val="single"/>
+              <w:bottom w:color="000000" w:space="0" w:sz="8" w:val="single"/>
+              <w:right w:color="000000" w:space="0" w:sz="8" w:val="single"/>
             </w:tcBorders>
             <w:tcMar>
               <w:top w:w="100.0" w:type="dxa"/>
@@ -1041,10 +1023,10 @@
         <w:tc>
           <w:tcPr>
             <w:tcBorders>
-              <w:top w:color="000000" w:space="0" w:sz="0" w:val="nil"/>
-              <w:left w:color="000000" w:space="0" w:sz="0" w:val="nil"/>
-              <w:bottom w:color="000000" w:space="0" w:sz="0" w:val="nil"/>
-              <w:right w:color="000000" w:space="0" w:sz="0" w:val="nil"/>
+              <w:top w:color="000000" w:space="0" w:sz="8" w:val="single"/>
+              <w:left w:color="000000" w:space="0" w:sz="8" w:val="single"/>
+              <w:bottom w:color="000000" w:space="0" w:sz="8" w:val="single"/>
+              <w:right w:color="000000" w:space="0" w:sz="8" w:val="single"/>
             </w:tcBorders>
             <w:tcMar>
               <w:top w:w="100.0" w:type="dxa"/>
@@ -1081,10 +1063,10 @@
         <w:tc>
           <w:tcPr>
             <w:tcBorders>
-              <w:top w:color="000000" w:space="0" w:sz="0" w:val="nil"/>
-              <w:left w:color="000000" w:space="0" w:sz="0" w:val="nil"/>
-              <w:bottom w:color="000000" w:space="0" w:sz="0" w:val="nil"/>
-              <w:right w:color="000000" w:space="0" w:sz="0" w:val="nil"/>
+              <w:top w:color="000000" w:space="0" w:sz="8" w:val="single"/>
+              <w:left w:color="000000" w:space="0" w:sz="8" w:val="single"/>
+              <w:bottom w:color="000000" w:space="0" w:sz="8" w:val="single"/>
+              <w:right w:color="000000" w:space="0" w:sz="8" w:val="single"/>
             </w:tcBorders>
             <w:tcMar>
               <w:top w:w="100.0" w:type="dxa"/>
@@ -1121,10 +1103,10 @@
         <w:tc>
           <w:tcPr>
             <w:tcBorders>
-              <w:top w:color="000000" w:space="0" w:sz="0" w:val="nil"/>
-              <w:left w:color="000000" w:space="0" w:sz="0" w:val="nil"/>
-              <w:bottom w:color="000000" w:space="0" w:sz="0" w:val="nil"/>
-              <w:right w:color="000000" w:space="0" w:sz="0" w:val="nil"/>
+              <w:top w:color="000000" w:space="0" w:sz="8" w:val="single"/>
+              <w:left w:color="000000" w:space="0" w:sz="8" w:val="single"/>
+              <w:bottom w:color="000000" w:space="0" w:sz="8" w:val="single"/>
+              <w:right w:color="000000" w:space="0" w:sz="8" w:val="single"/>
             </w:tcBorders>
             <w:tcMar>
               <w:top w:w="100.0" w:type="dxa"/>
@@ -1158,10 +1140,10 @@
         <w:tc>
           <w:tcPr>
             <w:tcBorders>
-              <w:top w:color="000000" w:space="0" w:sz="0" w:val="nil"/>
-              <w:left w:color="000000" w:space="0" w:sz="0" w:val="nil"/>
-              <w:bottom w:color="000000" w:space="0" w:sz="0" w:val="nil"/>
-              <w:right w:color="000000" w:space="0" w:sz="0" w:val="nil"/>
+              <w:top w:color="000000" w:space="0" w:sz="8" w:val="single"/>
+              <w:left w:color="000000" w:space="0" w:sz="8" w:val="single"/>
+              <w:bottom w:color="000000" w:space="0" w:sz="8" w:val="single"/>
+              <w:right w:color="000000" w:space="0" w:sz="8" w:val="single"/>
             </w:tcBorders>
             <w:tcMar>
               <w:top w:w="100.0" w:type="dxa"/>
@@ -1198,10 +1180,10 @@
         <w:tc>
           <w:tcPr>
             <w:tcBorders>
-              <w:top w:color="000000" w:space="0" w:sz="0" w:val="nil"/>
-              <w:left w:color="000000" w:space="0" w:sz="0" w:val="nil"/>
-              <w:bottom w:color="000000" w:space="0" w:sz="0" w:val="nil"/>
-              <w:right w:color="000000" w:space="0" w:sz="0" w:val="nil"/>
+              <w:top w:color="000000" w:space="0" w:sz="8" w:val="single"/>
+              <w:left w:color="000000" w:space="0" w:sz="8" w:val="single"/>
+              <w:bottom w:color="000000" w:space="0" w:sz="8" w:val="single"/>
+              <w:right w:color="000000" w:space="0" w:sz="8" w:val="single"/>
             </w:tcBorders>
             <w:tcMar>
               <w:top w:w="100.0" w:type="dxa"/>
@@ -1238,10 +1220,10 @@
         <w:tc>
           <w:tcPr>
             <w:tcBorders>
-              <w:top w:color="000000" w:space="0" w:sz="0" w:val="nil"/>
-              <w:left w:color="000000" w:space="0" w:sz="0" w:val="nil"/>
-              <w:bottom w:color="000000" w:space="0" w:sz="0" w:val="nil"/>
-              <w:right w:color="000000" w:space="0" w:sz="0" w:val="nil"/>
+              <w:top w:color="000000" w:space="0" w:sz="8" w:val="single"/>
+              <w:left w:color="000000" w:space="0" w:sz="8" w:val="single"/>
+              <w:bottom w:color="000000" w:space="0" w:sz="8" w:val="single"/>
+              <w:right w:color="000000" w:space="0" w:sz="8" w:val="single"/>
             </w:tcBorders>
             <w:tcMar>
               <w:top w:w="100.0" w:type="dxa"/>
@@ -1275,10 +1257,10 @@
         <w:tc>
           <w:tcPr>
             <w:tcBorders>
-              <w:top w:color="000000" w:space="0" w:sz="0" w:val="nil"/>
-              <w:left w:color="000000" w:space="0" w:sz="0" w:val="nil"/>
-              <w:bottom w:color="000000" w:space="0" w:sz="0" w:val="nil"/>
-              <w:right w:color="000000" w:space="0" w:sz="0" w:val="nil"/>
+              <w:top w:color="000000" w:space="0" w:sz="8" w:val="single"/>
+              <w:left w:color="000000" w:space="0" w:sz="8" w:val="single"/>
+              <w:bottom w:color="000000" w:space="0" w:sz="8" w:val="single"/>
+              <w:right w:color="000000" w:space="0" w:sz="8" w:val="single"/>
             </w:tcBorders>
             <w:tcMar>
               <w:top w:w="100.0" w:type="dxa"/>
@@ -1315,10 +1297,10 @@
         <w:tc>
           <w:tcPr>
             <w:tcBorders>
-              <w:top w:color="000000" w:space="0" w:sz="0" w:val="nil"/>
-              <w:left w:color="000000" w:space="0" w:sz="0" w:val="nil"/>
-              <w:bottom w:color="000000" w:space="0" w:sz="0" w:val="nil"/>
-              <w:right w:color="000000" w:space="0" w:sz="0" w:val="nil"/>
+              <w:top w:color="000000" w:space="0" w:sz="8" w:val="single"/>
+              <w:left w:color="000000" w:space="0" w:sz="8" w:val="single"/>
+              <w:bottom w:color="000000" w:space="0" w:sz="8" w:val="single"/>
+              <w:right w:color="000000" w:space="0" w:sz="8" w:val="single"/>
             </w:tcBorders>
             <w:tcMar>
               <w:top w:w="100.0" w:type="dxa"/>
@@ -1355,10 +1337,10 @@
         <w:tc>
           <w:tcPr>
             <w:tcBorders>
-              <w:top w:color="000000" w:space="0" w:sz="0" w:val="nil"/>
-              <w:left w:color="000000" w:space="0" w:sz="0" w:val="nil"/>
-              <w:bottom w:color="000000" w:space="0" w:sz="0" w:val="nil"/>
-              <w:right w:color="000000" w:space="0" w:sz="0" w:val="nil"/>
+              <w:top w:color="000000" w:space="0" w:sz="8" w:val="single"/>
+              <w:left w:color="000000" w:space="0" w:sz="8" w:val="single"/>
+              <w:bottom w:color="000000" w:space="0" w:sz="8" w:val="single"/>
+              <w:right w:color="000000" w:space="0" w:sz="8" w:val="single"/>
             </w:tcBorders>
             <w:tcMar>
               <w:top w:w="100.0" w:type="dxa"/>
@@ -1392,10 +1374,10 @@
         <w:tc>
           <w:tcPr>
             <w:tcBorders>
-              <w:top w:color="000000" w:space="0" w:sz="0" w:val="nil"/>
-              <w:left w:color="000000" w:space="0" w:sz="0" w:val="nil"/>
-              <w:bottom w:color="000000" w:space="0" w:sz="0" w:val="nil"/>
-              <w:right w:color="000000" w:space="0" w:sz="0" w:val="nil"/>
+              <w:top w:color="000000" w:space="0" w:sz="8" w:val="single"/>
+              <w:left w:color="000000" w:space="0" w:sz="8" w:val="single"/>
+              <w:bottom w:color="000000" w:space="0" w:sz="8" w:val="single"/>
+              <w:right w:color="000000" w:space="0" w:sz="8" w:val="single"/>
             </w:tcBorders>
             <w:tcMar>
               <w:top w:w="100.0" w:type="dxa"/>
@@ -1432,10 +1414,10 @@
         <w:tc>
           <w:tcPr>
             <w:tcBorders>
-              <w:top w:color="000000" w:space="0" w:sz="0" w:val="nil"/>
-              <w:left w:color="000000" w:space="0" w:sz="0" w:val="nil"/>
-              <w:bottom w:color="000000" w:space="0" w:sz="0" w:val="nil"/>
-              <w:right w:color="000000" w:space="0" w:sz="0" w:val="nil"/>
+              <w:top w:color="000000" w:space="0" w:sz="8" w:val="single"/>
+              <w:left w:color="000000" w:space="0" w:sz="8" w:val="single"/>
+              <w:bottom w:color="000000" w:space="0" w:sz="8" w:val="single"/>
+              <w:right w:color="000000" w:space="0" w:sz="8" w:val="single"/>
             </w:tcBorders>
             <w:tcMar>
               <w:top w:w="100.0" w:type="dxa"/>
@@ -1472,10 +1454,10 @@
         <w:tc>
           <w:tcPr>
             <w:tcBorders>
-              <w:top w:color="000000" w:space="0" w:sz="0" w:val="nil"/>
-              <w:left w:color="000000" w:space="0" w:sz="0" w:val="nil"/>
-              <w:bottom w:color="000000" w:space="0" w:sz="0" w:val="nil"/>
-              <w:right w:color="000000" w:space="0" w:sz="0" w:val="nil"/>
+              <w:top w:color="000000" w:space="0" w:sz="8" w:val="single"/>
+              <w:left w:color="000000" w:space="0" w:sz="8" w:val="single"/>
+              <w:bottom w:color="000000" w:space="0" w:sz="8" w:val="single"/>
+              <w:right w:color="000000" w:space="0" w:sz="8" w:val="single"/>
             </w:tcBorders>
             <w:tcMar>
               <w:top w:w="100.0" w:type="dxa"/>
@@ -1509,10 +1491,10 @@
         <w:tc>
           <w:tcPr>
             <w:tcBorders>
-              <w:top w:color="000000" w:space="0" w:sz="0" w:val="nil"/>
-              <w:left w:color="000000" w:space="0" w:sz="0" w:val="nil"/>
-              <w:bottom w:color="000000" w:space="0" w:sz="0" w:val="nil"/>
-              <w:right w:color="000000" w:space="0" w:sz="0" w:val="nil"/>
+              <w:top w:color="000000" w:space="0" w:sz="8" w:val="single"/>
+              <w:left w:color="000000" w:space="0" w:sz="8" w:val="single"/>
+              <w:bottom w:color="000000" w:space="0" w:sz="8" w:val="single"/>
+              <w:right w:color="000000" w:space="0" w:sz="8" w:val="single"/>
             </w:tcBorders>
             <w:tcMar>
               <w:top w:w="100.0" w:type="dxa"/>
@@ -1549,10 +1531,10 @@
         <w:tc>
           <w:tcPr>
             <w:tcBorders>
-              <w:top w:color="000000" w:space="0" w:sz="0" w:val="nil"/>
-              <w:left w:color="000000" w:space="0" w:sz="0" w:val="nil"/>
-              <w:bottom w:color="000000" w:space="0" w:sz="0" w:val="nil"/>
-              <w:right w:color="000000" w:space="0" w:sz="0" w:val="nil"/>
+              <w:top w:color="000000" w:space="0" w:sz="8" w:val="single"/>
+              <w:left w:color="000000" w:space="0" w:sz="8" w:val="single"/>
+              <w:bottom w:color="000000" w:space="0" w:sz="8" w:val="single"/>
+              <w:right w:color="000000" w:space="0" w:sz="8" w:val="single"/>
             </w:tcBorders>
             <w:tcMar>
               <w:top w:w="100.0" w:type="dxa"/>
@@ -1589,10 +1571,10 @@
         <w:tc>
           <w:tcPr>
             <w:tcBorders>
-              <w:top w:color="000000" w:space="0" w:sz="0" w:val="nil"/>
-              <w:left w:color="000000" w:space="0" w:sz="0" w:val="nil"/>
-              <w:bottom w:color="000000" w:space="0" w:sz="0" w:val="nil"/>
-              <w:right w:color="000000" w:space="0" w:sz="0" w:val="nil"/>
+              <w:top w:color="000000" w:space="0" w:sz="8" w:val="single"/>
+              <w:left w:color="000000" w:space="0" w:sz="8" w:val="single"/>
+              <w:bottom w:color="000000" w:space="0" w:sz="8" w:val="single"/>
+              <w:right w:color="000000" w:space="0" w:sz="8" w:val="single"/>
             </w:tcBorders>
             <w:tcMar>
               <w:top w:w="100.0" w:type="dxa"/>
@@ -1626,10 +1608,10 @@
         <w:tc>
           <w:tcPr>
             <w:tcBorders>
-              <w:top w:color="000000" w:space="0" w:sz="0" w:val="nil"/>
-              <w:left w:color="000000" w:space="0" w:sz="0" w:val="nil"/>
-              <w:bottom w:color="000000" w:space="0" w:sz="0" w:val="nil"/>
-              <w:right w:color="000000" w:space="0" w:sz="0" w:val="nil"/>
+              <w:top w:color="000000" w:space="0" w:sz="8" w:val="single"/>
+              <w:left w:color="000000" w:space="0" w:sz="8" w:val="single"/>
+              <w:bottom w:color="000000" w:space="0" w:sz="8" w:val="single"/>
+              <w:right w:color="000000" w:space="0" w:sz="8" w:val="single"/>
             </w:tcBorders>
             <w:tcMar>
               <w:top w:w="100.0" w:type="dxa"/>
@@ -1666,10 +1648,10 @@
         <w:tc>
           <w:tcPr>
             <w:tcBorders>
-              <w:top w:color="000000" w:space="0" w:sz="0" w:val="nil"/>
-              <w:left w:color="000000" w:space="0" w:sz="0" w:val="nil"/>
-              <w:bottom w:color="000000" w:space="0" w:sz="0" w:val="nil"/>
-              <w:right w:color="000000" w:space="0" w:sz="0" w:val="nil"/>
+              <w:top w:color="000000" w:space="0" w:sz="8" w:val="single"/>
+              <w:left w:color="000000" w:space="0" w:sz="8" w:val="single"/>
+              <w:bottom w:color="000000" w:space="0" w:sz="8" w:val="single"/>
+              <w:right w:color="000000" w:space="0" w:sz="8" w:val="single"/>
             </w:tcBorders>
             <w:tcMar>
               <w:top w:w="100.0" w:type="dxa"/>
@@ -1706,10 +1688,10 @@
         <w:tc>
           <w:tcPr>
             <w:tcBorders>
-              <w:top w:color="000000" w:space="0" w:sz="0" w:val="nil"/>
-              <w:left w:color="000000" w:space="0" w:sz="0" w:val="nil"/>
-              <w:bottom w:color="000000" w:space="0" w:sz="0" w:val="nil"/>
-              <w:right w:color="000000" w:space="0" w:sz="0" w:val="nil"/>
+              <w:top w:color="000000" w:space="0" w:sz="8" w:val="single"/>
+              <w:left w:color="000000" w:space="0" w:sz="8" w:val="single"/>
+              <w:bottom w:color="000000" w:space="0" w:sz="8" w:val="single"/>
+              <w:right w:color="000000" w:space="0" w:sz="8" w:val="single"/>
             </w:tcBorders>
             <w:tcMar>
               <w:top w:w="100.0" w:type="dxa"/>
@@ -1743,10 +1725,10 @@
         <w:tc>
           <w:tcPr>
             <w:tcBorders>
-              <w:top w:color="000000" w:space="0" w:sz="0" w:val="nil"/>
-              <w:left w:color="000000" w:space="0" w:sz="0" w:val="nil"/>
-              <w:bottom w:color="000000" w:space="0" w:sz="0" w:val="nil"/>
-              <w:right w:color="000000" w:space="0" w:sz="0" w:val="nil"/>
+              <w:top w:color="000000" w:space="0" w:sz="8" w:val="single"/>
+              <w:left w:color="000000" w:space="0" w:sz="8" w:val="single"/>
+              <w:bottom w:color="000000" w:space="0" w:sz="8" w:val="single"/>
+              <w:right w:color="000000" w:space="0" w:sz="8" w:val="single"/>
             </w:tcBorders>
             <w:tcMar>
               <w:top w:w="100.0" w:type="dxa"/>
@@ -1783,10 +1765,10 @@
         <w:tc>
           <w:tcPr>
             <w:tcBorders>
-              <w:top w:color="000000" w:space="0" w:sz="0" w:val="nil"/>
-              <w:left w:color="000000" w:space="0" w:sz="0" w:val="nil"/>
-              <w:bottom w:color="000000" w:space="0" w:sz="0" w:val="nil"/>
-              <w:right w:color="000000" w:space="0" w:sz="0" w:val="nil"/>
+              <w:top w:color="000000" w:space="0" w:sz="8" w:val="single"/>
+              <w:left w:color="000000" w:space="0" w:sz="8" w:val="single"/>
+              <w:bottom w:color="000000" w:space="0" w:sz="8" w:val="single"/>
+              <w:right w:color="000000" w:space="0" w:sz="8" w:val="single"/>
             </w:tcBorders>
             <w:tcMar>
               <w:top w:w="100.0" w:type="dxa"/>
@@ -1823,10 +1805,10 @@
         <w:tc>
           <w:tcPr>
             <w:tcBorders>
-              <w:top w:color="000000" w:space="0" w:sz="0" w:val="nil"/>
-              <w:left w:color="000000" w:space="0" w:sz="0" w:val="nil"/>
-              <w:bottom w:color="000000" w:space="0" w:sz="0" w:val="nil"/>
-              <w:right w:color="000000" w:space="0" w:sz="0" w:val="nil"/>
+              <w:top w:color="000000" w:space="0" w:sz="8" w:val="single"/>
+              <w:left w:color="000000" w:space="0" w:sz="8" w:val="single"/>
+              <w:bottom w:color="000000" w:space="0" w:sz="8" w:val="single"/>
+              <w:right w:color="000000" w:space="0" w:sz="8" w:val="single"/>
             </w:tcBorders>
             <w:tcMar>
               <w:top w:w="100.0" w:type="dxa"/>
@@ -1860,10 +1842,10 @@
         <w:tc>
           <w:tcPr>
             <w:tcBorders>
-              <w:top w:color="000000" w:space="0" w:sz="0" w:val="nil"/>
-              <w:left w:color="000000" w:space="0" w:sz="0" w:val="nil"/>
-              <w:bottom w:color="000000" w:space="0" w:sz="0" w:val="nil"/>
-              <w:right w:color="000000" w:space="0" w:sz="0" w:val="nil"/>
+              <w:top w:color="000000" w:space="0" w:sz="8" w:val="single"/>
+              <w:left w:color="000000" w:space="0" w:sz="8" w:val="single"/>
+              <w:bottom w:color="000000" w:space="0" w:sz="8" w:val="single"/>
+              <w:right w:color="000000" w:space="0" w:sz="8" w:val="single"/>
             </w:tcBorders>
             <w:tcMar>
               <w:top w:w="100.0" w:type="dxa"/>
@@ -1900,10 +1882,10 @@
         <w:tc>
           <w:tcPr>
             <w:tcBorders>
-              <w:top w:color="000000" w:space="0" w:sz="0" w:val="nil"/>
-              <w:left w:color="000000" w:space="0" w:sz="0" w:val="nil"/>
-              <w:bottom w:color="000000" w:space="0" w:sz="0" w:val="nil"/>
-              <w:right w:color="000000" w:space="0" w:sz="0" w:val="nil"/>
+              <w:top w:color="000000" w:space="0" w:sz="8" w:val="single"/>
+              <w:left w:color="000000" w:space="0" w:sz="8" w:val="single"/>
+              <w:bottom w:color="000000" w:space="0" w:sz="8" w:val="single"/>
+              <w:right w:color="000000" w:space="0" w:sz="8" w:val="single"/>
             </w:tcBorders>
             <w:tcMar>
               <w:top w:w="100.0" w:type="dxa"/>
@@ -1940,10 +1922,10 @@
         <w:tc>
           <w:tcPr>
             <w:tcBorders>
-              <w:top w:color="000000" w:space="0" w:sz="0" w:val="nil"/>
-              <w:left w:color="000000" w:space="0" w:sz="0" w:val="nil"/>
-              <w:bottom w:color="000000" w:space="0" w:sz="0" w:val="nil"/>
-              <w:right w:color="000000" w:space="0" w:sz="0" w:val="nil"/>
+              <w:top w:color="000000" w:space="0" w:sz="8" w:val="single"/>
+              <w:left w:color="000000" w:space="0" w:sz="8" w:val="single"/>
+              <w:bottom w:color="000000" w:space="0" w:sz="8" w:val="single"/>
+              <w:right w:color="000000" w:space="0" w:sz="8" w:val="single"/>
             </w:tcBorders>
             <w:tcMar>
               <w:top w:w="100.0" w:type="dxa"/>
@@ -1977,10 +1959,10 @@
         <w:tc>
           <w:tcPr>
             <w:tcBorders>
-              <w:top w:color="000000" w:space="0" w:sz="0" w:val="nil"/>
-              <w:left w:color="000000" w:space="0" w:sz="0" w:val="nil"/>
-              <w:bottom w:color="000000" w:space="0" w:sz="0" w:val="nil"/>
-              <w:right w:color="000000" w:space="0" w:sz="0" w:val="nil"/>
+              <w:top w:color="000000" w:space="0" w:sz="8" w:val="single"/>
+              <w:left w:color="000000" w:space="0" w:sz="8" w:val="single"/>
+              <w:bottom w:color="000000" w:space="0" w:sz="8" w:val="single"/>
+              <w:right w:color="000000" w:space="0" w:sz="8" w:val="single"/>
             </w:tcBorders>
             <w:tcMar>
               <w:top w:w="100.0" w:type="dxa"/>
@@ -2017,10 +1999,10 @@
         <w:tc>
           <w:tcPr>
             <w:tcBorders>
-              <w:top w:color="000000" w:space="0" w:sz="0" w:val="nil"/>
-              <w:left w:color="000000" w:space="0" w:sz="0" w:val="nil"/>
-              <w:bottom w:color="000000" w:space="0" w:sz="0" w:val="nil"/>
-              <w:right w:color="000000" w:space="0" w:sz="0" w:val="nil"/>
+              <w:top w:color="000000" w:space="0" w:sz="8" w:val="single"/>
+              <w:left w:color="000000" w:space="0" w:sz="8" w:val="single"/>
+              <w:bottom w:color="000000" w:space="0" w:sz="8" w:val="single"/>
+              <w:right w:color="000000" w:space="0" w:sz="8" w:val="single"/>
             </w:tcBorders>
             <w:tcMar>
               <w:top w:w="100.0" w:type="dxa"/>
@@ -2057,10 +2039,10 @@
         <w:tc>
           <w:tcPr>
             <w:tcBorders>
-              <w:top w:color="000000" w:space="0" w:sz="0" w:val="nil"/>
-              <w:left w:color="000000" w:space="0" w:sz="0" w:val="nil"/>
-              <w:bottom w:color="000000" w:space="0" w:sz="0" w:val="nil"/>
-              <w:right w:color="000000" w:space="0" w:sz="0" w:val="nil"/>
+              <w:top w:color="000000" w:space="0" w:sz="8" w:val="single"/>
+              <w:left w:color="000000" w:space="0" w:sz="8" w:val="single"/>
+              <w:bottom w:color="000000" w:space="0" w:sz="8" w:val="single"/>
+              <w:right w:color="000000" w:space="0" w:sz="8" w:val="single"/>
             </w:tcBorders>
             <w:tcMar>
               <w:top w:w="100.0" w:type="dxa"/>
@@ -2094,10 +2076,10 @@
         <w:tc>
           <w:tcPr>
             <w:tcBorders>
-              <w:top w:color="000000" w:space="0" w:sz="0" w:val="nil"/>
-              <w:left w:color="000000" w:space="0" w:sz="0" w:val="nil"/>
-              <w:bottom w:color="000000" w:space="0" w:sz="0" w:val="nil"/>
-              <w:right w:color="000000" w:space="0" w:sz="0" w:val="nil"/>
+              <w:top w:color="000000" w:space="0" w:sz="8" w:val="single"/>
+              <w:left w:color="000000" w:space="0" w:sz="8" w:val="single"/>
+              <w:bottom w:color="000000" w:space="0" w:sz="8" w:val="single"/>
+              <w:right w:color="000000" w:space="0" w:sz="8" w:val="single"/>
             </w:tcBorders>
             <w:tcMar>
               <w:top w:w="100.0" w:type="dxa"/>
@@ -2134,10 +2116,10 @@
         <w:tc>
           <w:tcPr>
             <w:tcBorders>
-              <w:top w:color="000000" w:space="0" w:sz="0" w:val="nil"/>
-              <w:left w:color="000000" w:space="0" w:sz="0" w:val="nil"/>
-              <w:bottom w:color="000000" w:space="0" w:sz="0" w:val="nil"/>
-              <w:right w:color="000000" w:space="0" w:sz="0" w:val="nil"/>
+              <w:top w:color="000000" w:space="0" w:sz="8" w:val="single"/>
+              <w:left w:color="000000" w:space="0" w:sz="8" w:val="single"/>
+              <w:bottom w:color="000000" w:space="0" w:sz="8" w:val="single"/>
+              <w:right w:color="000000" w:space="0" w:sz="8" w:val="single"/>
             </w:tcBorders>
             <w:tcMar>
               <w:top w:w="100.0" w:type="dxa"/>
@@ -2174,10 +2156,10 @@
         <w:tc>
           <w:tcPr>
             <w:tcBorders>
-              <w:top w:color="000000" w:space="0" w:sz="0" w:val="nil"/>
-              <w:left w:color="000000" w:space="0" w:sz="0" w:val="nil"/>
-              <w:bottom w:color="000000" w:space="0" w:sz="0" w:val="nil"/>
-              <w:right w:color="000000" w:space="0" w:sz="0" w:val="nil"/>
+              <w:top w:color="000000" w:space="0" w:sz="8" w:val="single"/>
+              <w:left w:color="000000" w:space="0" w:sz="8" w:val="single"/>
+              <w:bottom w:color="000000" w:space="0" w:sz="8" w:val="single"/>
+              <w:right w:color="000000" w:space="0" w:sz="8" w:val="single"/>
             </w:tcBorders>
             <w:tcMar>
               <w:top w:w="100.0" w:type="dxa"/>
@@ -2211,10 +2193,10 @@
         <w:tc>
           <w:tcPr>
             <w:tcBorders>
-              <w:top w:color="000000" w:space="0" w:sz="0" w:val="nil"/>
-              <w:left w:color="000000" w:space="0" w:sz="0" w:val="nil"/>
-              <w:bottom w:color="000000" w:space="0" w:sz="0" w:val="nil"/>
-              <w:right w:color="000000" w:space="0" w:sz="0" w:val="nil"/>
+              <w:top w:color="000000" w:space="0" w:sz="8" w:val="single"/>
+              <w:left w:color="000000" w:space="0" w:sz="8" w:val="single"/>
+              <w:bottom w:color="000000" w:space="0" w:sz="8" w:val="single"/>
+              <w:right w:color="000000" w:space="0" w:sz="8" w:val="single"/>
             </w:tcBorders>
             <w:tcMar>
               <w:top w:w="100.0" w:type="dxa"/>
@@ -2251,10 +2233,10 @@
         <w:tc>
           <w:tcPr>
             <w:tcBorders>
-              <w:top w:color="000000" w:space="0" w:sz="0" w:val="nil"/>
-              <w:left w:color="000000" w:space="0" w:sz="0" w:val="nil"/>
-              <w:bottom w:color="000000" w:space="0" w:sz="0" w:val="nil"/>
-              <w:right w:color="000000" w:space="0" w:sz="0" w:val="nil"/>
+              <w:top w:color="000000" w:space="0" w:sz="8" w:val="single"/>
+              <w:left w:color="000000" w:space="0" w:sz="8" w:val="single"/>
+              <w:bottom w:color="000000" w:space="0" w:sz="8" w:val="single"/>
+              <w:right w:color="000000" w:space="0" w:sz="8" w:val="single"/>
             </w:tcBorders>
             <w:tcMar>
               <w:top w:w="100.0" w:type="dxa"/>
@@ -2291,10 +2273,10 @@
         <w:tc>
           <w:tcPr>
             <w:tcBorders>
-              <w:top w:color="000000" w:space="0" w:sz="0" w:val="nil"/>
-              <w:left w:color="000000" w:space="0" w:sz="0" w:val="nil"/>
-              <w:bottom w:color="000000" w:space="0" w:sz="0" w:val="nil"/>
-              <w:right w:color="000000" w:space="0" w:sz="0" w:val="nil"/>
+              <w:top w:color="000000" w:space="0" w:sz="8" w:val="single"/>
+              <w:left w:color="000000" w:space="0" w:sz="8" w:val="single"/>
+              <w:bottom w:color="000000" w:space="0" w:sz="8" w:val="single"/>
+              <w:right w:color="000000" w:space="0" w:sz="8" w:val="single"/>
             </w:tcBorders>
             <w:tcMar>
               <w:top w:w="100.0" w:type="dxa"/>
@@ -2328,10 +2310,10 @@
         <w:tc>
           <w:tcPr>
             <w:tcBorders>
-              <w:top w:color="000000" w:space="0" w:sz="0" w:val="nil"/>
-              <w:left w:color="000000" w:space="0" w:sz="0" w:val="nil"/>
-              <w:bottom w:color="000000" w:space="0" w:sz="0" w:val="nil"/>
-              <w:right w:color="000000" w:space="0" w:sz="0" w:val="nil"/>
+              <w:top w:color="000000" w:space="0" w:sz="8" w:val="single"/>
+              <w:left w:color="000000" w:space="0" w:sz="8" w:val="single"/>
+              <w:bottom w:color="000000" w:space="0" w:sz="8" w:val="single"/>
+              <w:right w:color="000000" w:space="0" w:sz="8" w:val="single"/>
             </w:tcBorders>
             <w:tcMar>
               <w:top w:w="100.0" w:type="dxa"/>
@@ -2509,7 +2491,7 @@
           <w:highlight w:val="white"/>
           <w:rtl w:val="0"/>
         </w:rPr>
-        <w:t xml:space="preserve">Se deja constancia de la evaluación realizada en las actividades previas respecto a la posibilidad de agrupar la presente contratación o utilizar la figura del contrato marco, según lo establecido en el Art. 24 (j) de las Normas SUNAI, concluyendo lo siguiente: {viabilidad_contrato_marco}.</w:t>
+        <w:t xml:space="preserve">{viabilidad_contrato_marco_au_au}.</w:t>
       </w:r>
       <w:r>
         <w:rPr>
@@ -2621,23 +2603,6 @@
       </w:pPr>
       <w:r>
         <w:rPr>
-          <w:rtl w:val="0"/>
-        </w:rPr>
-      </w:r>
-    </w:p>
-    <w:p>
-      <w:pPr>
-        <w:shd w:fill="ffffff" w:val="clear"/>
-        <w:spacing w:after="280" w:before="220" w:line="342.85714285714283" w:lineRule="auto"/>
-        <w:jc w:val="both"/>
-        <w:rPr>
-          <w:b w:val="1"/>
-          <w:bCs w:val="1"/>
-          <w:color w:val="1a1c1e"/>
-        </w:rPr>
-      </w:pPr>
-      <w:r>
-        <w:rPr>
           <w:b w:val="1"/>
           <w:bCs w:val="1"/>
           <w:color w:val="1a1c1e"/>
@@ -2664,23 +2629,6 @@
         <w:t xml:space="preserve">C.I. V.- {cedula_miembro_economica}</w:t>
         <w:br w:type="textWrapping"/>
         <w:t xml:space="preserve">MIEMBRO PRINCIPAL - ÁREA ECONÓMICO-FINANCIERA</w:t>
-      </w:r>
-    </w:p>
-    <w:p>
-      <w:pPr>
-        <w:shd w:fill="ffffff" w:val="clear"/>
-        <w:spacing w:after="280" w:before="220" w:line="342.85714285714283" w:lineRule="auto"/>
-        <w:jc w:val="both"/>
-        <w:rPr>
-          <w:b w:val="1"/>
-          <w:bCs w:val="1"/>
-          <w:color w:val="1a1c1e"/>
-        </w:rPr>
-      </w:pPr>
-      <w:r>
-        <w:rPr>
-          <w:rtl w:val="0"/>
-        </w:rPr>
       </w:r>
     </w:p>
     <w:p>
@@ -2777,12 +2725,60 @@
       </w:r>
     </w:p>
     <w:sectPr>
+      <w:headerReference r:id="rId6" w:type="default"/>
+      <w:footerReference r:id="rId7" w:type="default"/>
       <w:pgSz w:h="16834" w:w="11909" w:orient="portrait"/>
-      <w:pgMar w:bottom="1440" w:top="1440" w:left="1440" w:right="1440" w:header="720" w:footer="720"/>
+      <w:pgMar w:bottom="1440" w:top="1440" w:left="1440" w:right="1440" w:header="283.46456692913387" w:footer="720"/>
       <w:pgNumType w:start="1"/>
     </w:sectPr>
   </w:body>
 </w:document>
+</file>
+
+<file path=word/footer1.xml><?xml version="1.0" encoding="utf-8"?>
+<w:ftr xmlns:mc="http://schemas.openxmlformats.org/markup-compatibility/2006" xmlns:o="urn:schemas-microsoft-com:office:office" xmlns:r="http://schemas.openxmlformats.org/officeDocument/2006/relationships" xmlns:m="http://schemas.openxmlformats.org/officeDocument/2006/math" xmlns:v="urn:schemas-microsoft-com:vml" xmlns:wp="http://schemas.openxmlformats.org/drawingml/2006/wordprocessingDrawing" xmlns:w10="urn:schemas-microsoft-com:office:word" xmlns:w="http://schemas.openxmlformats.org/wordprocessingml/2006/main" xmlns:wne="http://schemas.microsoft.com/office/word/2006/wordml" xmlns:sl="http://schemas.openxmlformats.org/schemaLibrary/2006/main" xmlns:a="http://schemas.openxmlformats.org/drawingml/2006/main" xmlns:pic="http://schemas.openxmlformats.org/drawingml/2006/picture" xmlns:c="http://schemas.openxmlformats.org/drawingml/2006/chart" xmlns:lc="http://schemas.openxmlformats.org/drawingml/2006/lockedCanvas" xmlns:dgm="http://schemas.openxmlformats.org/drawingml/2006/diagram" xmlns:wps="http://schemas.microsoft.com/office/word/2010/wordprocessingShape" xmlns:wpg="http://schemas.microsoft.com/office/word/2010/wordprocessingGroup" xmlns:w14="http://schemas.microsoft.com/office/word/2010/wordml" xmlns:w15="http://schemas.microsoft.com/office/word/2012/wordml" xmlns:w16="http://schemas.microsoft.com/office/word/2018/wordml" xmlns:w16cex="http://schemas.microsoft.com/office/word/2018/wordml/cex" xmlns:w16cid="http://schemas.microsoft.com/office/word/2016/wordml/cid" xmlns="http://schemas.microsoft.com/office/tasks/2019/documenttasks" xmlns:cr="http://schemas.microsoft.com/office/comments/2020/reactions">
+  <w:p>
+    <w:pPr>
+      <w:rPr/>
+    </w:pPr>
+    <w:r>
+      <w:rPr>
+        <w:rtl w:val="0"/>
+      </w:rPr>
+    </w:r>
+  </w:p>
+</w:ftr>
+</file>
+
+<file path=word/header1.xml><?xml version="1.0" encoding="utf-8"?>
+<w:hdr xmlns:mc="http://schemas.openxmlformats.org/markup-compatibility/2006" xmlns:o="urn:schemas-microsoft-com:office:office" xmlns:r="http://schemas.openxmlformats.org/officeDocument/2006/relationships" xmlns:m="http://schemas.openxmlformats.org/officeDocument/2006/math" xmlns:v="urn:schemas-microsoft-com:vml" xmlns:wp="http://schemas.openxmlformats.org/drawingml/2006/wordprocessingDrawing" xmlns:w10="urn:schemas-microsoft-com:office:word" xmlns:w="http://schemas.openxmlformats.org/wordprocessingml/2006/main" xmlns:wne="http://schemas.microsoft.com/office/word/2006/wordml" xmlns:sl="http://schemas.openxmlformats.org/schemaLibrary/2006/main" xmlns:a="http://schemas.openxmlformats.org/drawingml/2006/main" xmlns:pic="http://schemas.openxmlformats.org/drawingml/2006/picture" xmlns:c="http://schemas.openxmlformats.org/drawingml/2006/chart" xmlns:lc="http://schemas.openxmlformats.org/drawingml/2006/lockedCanvas" xmlns:dgm="http://schemas.openxmlformats.org/drawingml/2006/diagram" xmlns:wps="http://schemas.microsoft.com/office/word/2010/wordprocessingShape" xmlns:wpg="http://schemas.microsoft.com/office/word/2010/wordprocessingGroup" xmlns:w14="http://schemas.microsoft.com/office/word/2010/wordml" xmlns:w15="http://schemas.microsoft.com/office/word/2012/wordml" xmlns:w16="http://schemas.microsoft.com/office/word/2018/wordml" xmlns:w16cex="http://schemas.microsoft.com/office/word/2018/wordml/cex" xmlns:w16cid="http://schemas.microsoft.com/office/word/2016/wordml/cid" xmlns="http://schemas.microsoft.com/office/tasks/2019/documenttasks" xmlns:cr="http://schemas.microsoft.com/office/comments/2020/reactions">
+  <w:p>
+    <w:pPr>
+      <w:shd w:fill="ffffff" w:val="clear"/>
+      <w:spacing w:after="0" w:before="0" w:line="360" w:lineRule="auto"/>
+      <w:jc w:val="center"/>
+      <w:rPr/>
+    </w:pPr>
+    <w:r>
+      <w:rPr>
+        <w:b w:val="1"/>
+        <w:bCs w:val="1"/>
+        <w:color w:val="1a1c1e"/>
+        <w:rtl w:val="0"/>
+      </w:rPr>
+      <w:t xml:space="preserve">REPÚBLICA BOLIVARIANA DE VENEZUELA</w:t>
+      <w:br w:type="textWrapping"/>
+      <w:t xml:space="preserve">{nom_ente_contratante}</w:t>
+      <w:br w:type="textWrapping"/>
+      <w:t xml:space="preserve">COMISIÓN DE CONTRATACIONES</w:t>
+    </w:r>
+    <w:r>
+      <w:rPr>
+        <w:rtl w:val="0"/>
+      </w:rPr>
+    </w:r>
+  </w:p>
+</w:hdr>
 </file>
 
 <file path=word/numbering.xml><?xml version="1.0" encoding="utf-8"?>

</xml_diff>